<commit_message>
Prompt final pour insertion
</commit_message>
<xml_diff>
--- a/PorjetBDPrompt_Insertion_Template.docx
+++ b/PorjetBDPrompt_Insertion_Template.docx
@@ -2,133 +2,40 @@
 <file path=word/document.xml><?xml version="1.0" encoding="utf-8"?>
 <w:document xmlns:wpc="http://schemas.microsoft.com/office/word/2010/wordprocessingCanvas" xmlns:cx="http://schemas.microsoft.com/office/drawing/2014/chartex" xmlns:cx1="http://schemas.microsoft.com/office/drawing/2015/9/8/chartex" xmlns:cx2="http://schemas.microsoft.com/office/drawing/2015/10/21/chartex" xmlns:cx3="http://schemas.microsoft.com/office/drawing/2016/5/9/chartex" xmlns:cx4="http://schemas.microsoft.com/office/drawing/2016/5/10/chartex" xmlns:cx5="http://schemas.microsoft.com/office/drawing/2016/5/11/chartex" xmlns:cx6="http://schemas.microsoft.com/office/drawing/2016/5/12/chartex" xmlns:cx7="http://schemas.microsoft.com/office/drawing/2016/5/13/chartex" xmlns:cx8="http://schemas.microsoft.com/office/drawing/2016/5/14/chartex" xmlns:mc="http://schemas.openxmlformats.org/markup-compatibility/2006" xmlns:aink="http://schemas.microsoft.com/office/drawing/2016/ink" xmlns:am3d="http://schemas.microsoft.com/office/drawing/2017/model3d" xmlns:o="urn:schemas-microsoft-com:office:office" xmlns:oel="http://schemas.microsoft.com/office/2019/extlst" xmlns:r="http://schemas.openxmlformats.org/officeDocument/2006/relationships" xmlns:m="http://schemas.openxmlformats.org/officeDocument/2006/math" xmlns:v="urn:schemas-microsoft-com:vml" xmlns:wp14="http://schemas.microsoft.com/office/word/2010/wordprocessingDrawing" xmlns:wp="http://schemas.openxmlformats.org/drawingml/2006/wordprocessingDrawing" xmlns:w10="urn:schemas-microsoft-com:office:word" xmlns:w="http://schemas.openxmlformats.org/wordprocessingml/2006/main" xmlns:w14="http://schemas.microsoft.com/office/word/2010/wordml" xmlns:w15="http://schemas.microsoft.com/office/word/2012/wordml" xmlns:w16cex="http://schemas.microsoft.com/office/word/2018/wordml/cex" xmlns:w16cid="http://schemas.microsoft.com/office/word/2016/wordml/cid" xmlns:w16="http://schemas.microsoft.com/office/word/2018/wordml" xmlns:w16du="http://schemas.microsoft.com/office/word/2023/wordml/word16du" xmlns:w16sdtdh="http://schemas.microsoft.com/office/word/2020/wordml/sdtdatahash" xmlns:w16sdtfl="http://schemas.microsoft.com/office/word/2024/wordml/sdtformatlock" xmlns:w16se="http://schemas.microsoft.com/office/word/2015/wordml/symex" xmlns:wpg="http://schemas.microsoft.com/office/word/2010/wordprocessingGroup" xmlns:wpi="http://schemas.microsoft.com/office/word/2010/wordprocessingInk" xmlns:wne="http://schemas.microsoft.com/office/word/2006/wordml" xmlns:wps="http://schemas.microsoft.com/office/word/2010/wordprocessingShape" mc:Ignorable="w14 w15 w16se w16cid w16 w16cex w16sdtdh w16sdtfl w16du wp14">
   <w:body>
+    <w:p/>
     <w:p>
       <w:pPr>
         <w:pStyle w:val="Paragraphedeliste"/>
         <w:numPr>
           <w:ilvl w:val="0"/>
-          <w:numId w:val="2"/>
-        </w:numPr>
-      </w:pPr>
-      <w:r>
-        <w:t xml:space="preserve">Prompt proposé dans le TP1 : </w:t>
-      </w:r>
-    </w:p>
-    <w:p>
-      <w:r>
-        <w:t xml:space="preserve">Donne les </w:t>
-      </w:r>
-      <w:r>
-        <w:t>requêtes d’insertion</w:t>
-      </w:r>
-      <w:r>
-        <w:t xml:space="preserve"> permettant de remplir la base de données dont le modèle relationnel est le suivant : </w:t>
-      </w:r>
-    </w:p>
-    <w:p>
-      <w:r>
-        <w:rPr>
-          <w:highlight w:val="green"/>
-        </w:rPr>
-        <w:t>[COPIER VOTRE MODELE RELATIONNEL, INDIQUER QUELLES SONT LES CLES PRIMAIRES APRES CHAQUE RELATION]</w:t>
-      </w:r>
-    </w:p>
-    <w:p>
-      <w:r>
-        <w:t>L</w:t>
-      </w:r>
-      <w:r>
-        <w:t>es clés primaire</w:t>
-      </w:r>
-      <w:r>
-        <w:t>s</w:t>
-      </w:r>
-      <w:r>
-        <w:t xml:space="preserve"> correspondent aux id, sauf si autre chose est précisé (quand c'est un attribut composé) les clés étrangères sont identifiées par les #, et ont le même nom que les clés primaires auxquelles elles font référence</w:t>
-      </w:r>
-      <w:r>
-        <w:t>.</w:t>
-      </w:r>
-    </w:p>
-    <w:p>
-      <w:r>
-        <w:rPr>
-          <w:highlight w:val="green"/>
-        </w:rPr>
-        <w:t>[</w:t>
-      </w:r>
-      <w:r>
-        <w:rPr>
-          <w:highlight w:val="green"/>
-        </w:rPr>
-        <w:t>INDIQUER LE NOMBRE DE LIGNES SOUHAITE PAR TABLE, ET SI VOUS LE SOUHAITEZ DEMANDEZ A CE QUE CERTAINES VALEURS SOIENT PRESENTES (</w:t>
-      </w:r>
-      <w:r>
-        <w:rPr>
-          <w:highlight w:val="green"/>
-        </w:rPr>
-        <w:t xml:space="preserve">par exemple </w:t>
-      </w:r>
-      <w:r>
-        <w:rPr>
-          <w:highlight w:val="green"/>
-        </w:rPr>
-        <w:t>« mets le nom « python » dans l</w:t>
-      </w:r>
-      <w:r>
-        <w:rPr>
-          <w:highlight w:val="green"/>
-        </w:rPr>
-        <w:t>a liste des logiciels »</w:t>
-      </w:r>
-      <w:r>
-        <w:rPr>
-          <w:highlight w:val="green"/>
-        </w:rPr>
-        <w:t>]</w:t>
-      </w:r>
-      <w:r>
-        <w:br/>
-      </w:r>
-      <w:r>
-        <w:t xml:space="preserve">Les clés étrangères doivent faire référence aux clés primaires existantes : donne les lignes en commençant par remplir les tables dans lesquelles il n'y a pas de clés étrangères, puis les tables dans lesquelles les clés étrangères font références à des clés primaires des tables déjà remplies. </w:t>
-      </w:r>
-      <w:r>
-        <w:br/>
-      </w:r>
-      <w:r>
-        <w:br/>
-      </w:r>
-      <w:r>
-        <w:t>Fournis l'ensemble sous la forme d</w:t>
-      </w:r>
-      <w:r>
-        <w:t>’un script SQL prêt à être exécuté.</w:t>
-      </w:r>
-    </w:p>
-    <w:p/>
-    <w:p>
-      <w:pPr>
-        <w:pStyle w:val="Paragraphedeliste"/>
-        <w:numPr>
-          <w:ilvl w:val="0"/>
           <w:numId w:val="1"/>
         </w:numPr>
       </w:pPr>
       <w:r>
-        <w:t xml:space="preserve">Prompt pour l’IA projet : </w:t>
-      </w:r>
-    </w:p>
-    <w:p>
+        <w:t>Prompt</w:t>
+      </w:r>
+      <w:r>
+        <w:t> :</w:t>
+      </w:r>
+    </w:p>
+    <w:p>
+      <w:pPr>
+        <w:ind w:left="360"/>
+      </w:pPr>
       <w:r>
         <w:t>Donne les requêtes d’insertion permettant de remplir la base de données dont le modèle relationnel est le suivant :</w:t>
       </w:r>
     </w:p>
     <w:p>
+      <w:pPr>
+        <w:ind w:left="360"/>
+      </w:pPr>
+      <w:proofErr w:type="gramStart"/>
       <w:r>
         <w:t>LIEU(</w:t>
       </w:r>
       <w:proofErr w:type="spellStart"/>
+      <w:proofErr w:type="gramEnd"/>
       <w:r>
         <w:t>id_lieu</w:t>
       </w:r>
@@ -163,10 +70,12 @@
     </w:p>
     <w:p>
       <w:pPr>
-        <w:rPr>
-          <w:lang w:val="en-US"/>
-        </w:rPr>
-      </w:pPr>
+        <w:ind w:left="360"/>
+        <w:rPr>
+          <w:lang w:val="en-US"/>
+        </w:rPr>
+      </w:pPr>
+      <w:proofErr w:type="gramStart"/>
       <w:r>
         <w:rPr>
           <w:lang w:val="en-US"/>
@@ -174,6 +83,7 @@
         <w:t>ARTISTE(</w:t>
       </w:r>
       <w:proofErr w:type="spellStart"/>
+      <w:proofErr w:type="gramEnd"/>
       <w:r>
         <w:rPr>
           <w:lang w:val="en-US"/>
@@ -232,10 +142,12 @@
     </w:p>
     <w:p>
       <w:pPr>
-        <w:rPr>
-          <w:lang w:val="en-US"/>
-        </w:rPr>
-      </w:pPr>
+        <w:ind w:left="360"/>
+        <w:rPr>
+          <w:lang w:val="en-US"/>
+        </w:rPr>
+      </w:pPr>
+      <w:proofErr w:type="gramStart"/>
       <w:r>
         <w:rPr>
           <w:lang w:val="en-US"/>
@@ -243,6 +155,7 @@
         <w:t>EMPLOYE(</w:t>
       </w:r>
       <w:proofErr w:type="spellStart"/>
+      <w:proofErr w:type="gramEnd"/>
       <w:r>
         <w:rPr>
           <w:lang w:val="en-US"/>
@@ -301,10 +214,12 @@
     </w:p>
     <w:p>
       <w:pPr>
-        <w:rPr>
-          <w:lang w:val="en-US"/>
-        </w:rPr>
-      </w:pPr>
+        <w:ind w:left="360"/>
+        <w:rPr>
+          <w:lang w:val="en-US"/>
+        </w:rPr>
+      </w:pPr>
+      <w:proofErr w:type="gramStart"/>
       <w:r>
         <w:rPr>
           <w:lang w:val="en-US"/>
@@ -312,6 +227,7 @@
         <w:t>SPONSOR(</w:t>
       </w:r>
       <w:proofErr w:type="spellStart"/>
+      <w:proofErr w:type="gramEnd"/>
       <w:r>
         <w:rPr>
           <w:lang w:val="en-US"/>
@@ -342,10 +258,12 @@
     </w:p>
     <w:p>
       <w:pPr>
-        <w:rPr>
-          <w:lang w:val="en-US"/>
-        </w:rPr>
-      </w:pPr>
+        <w:ind w:left="360"/>
+        <w:rPr>
+          <w:lang w:val="en-US"/>
+        </w:rPr>
+      </w:pPr>
+      <w:proofErr w:type="gramStart"/>
       <w:r>
         <w:rPr>
           <w:lang w:val="en-US"/>
@@ -353,6 +271,7 @@
         <w:t>MATERIEL(</w:t>
       </w:r>
       <w:proofErr w:type="spellStart"/>
+      <w:proofErr w:type="gramEnd"/>
       <w:r>
         <w:rPr>
           <w:lang w:val="en-US"/>
@@ -382,10 +301,15 @@
       </w:r>
     </w:p>
     <w:p>
+      <w:pPr>
+        <w:ind w:left="360"/>
+      </w:pPr>
+      <w:proofErr w:type="gramStart"/>
       <w:r>
         <w:t>PARTICIPANT(</w:t>
       </w:r>
       <w:proofErr w:type="spellStart"/>
+      <w:proofErr w:type="gramEnd"/>
       <w:r>
         <w:t>id_part</w:t>
       </w:r>
@@ -402,8 +326,13 @@
         <w:t xml:space="preserve">, </w:t>
       </w:r>
       <w:proofErr w:type="spellStart"/>
-      <w:r>
-        <w:t>email_part</w:t>
+      <w:proofErr w:type="gramStart"/>
+      <w:r>
+        <w:t>email</w:t>
+      </w:r>
+      <w:proofErr w:type="gramEnd"/>
+      <w:r>
+        <w:t>_part</w:t>
       </w:r>
       <w:proofErr w:type="spellEnd"/>
       <w:r>
@@ -419,10 +348,15 @@
       </w:r>
     </w:p>
     <w:p>
+      <w:pPr>
+        <w:ind w:left="360"/>
+      </w:pPr>
+      <w:proofErr w:type="gramStart"/>
       <w:r>
         <w:t>EVENEMENT(</w:t>
       </w:r>
       <w:proofErr w:type="spellStart"/>
+      <w:proofErr w:type="gramEnd"/>
       <w:r>
         <w:t>id_ev</w:t>
       </w:r>
@@ -480,10 +414,15 @@
       </w:r>
     </w:p>
     <w:p>
+      <w:pPr>
+        <w:ind w:left="360"/>
+      </w:pPr>
+      <w:proofErr w:type="gramStart"/>
       <w:r>
         <w:t>CONTRAT(</w:t>
       </w:r>
       <w:proofErr w:type="spellStart"/>
+      <w:proofErr w:type="gramEnd"/>
       <w:r>
         <w:t>id_ev</w:t>
       </w:r>
@@ -534,17 +473,26 @@
     </w:p>
     <w:p>
       <w:pPr>
-        <w:rPr>
-          <w:lang w:val="en-US"/>
-        </w:rPr>
-      </w:pPr>
-      <w:r>
-        <w:rPr>
-          <w:lang w:val="en-US"/>
-        </w:rPr>
-        <w:t>CATEGORIE_BILLET(</w:t>
-      </w:r>
-      <w:proofErr w:type="spellStart"/>
+        <w:ind w:left="360"/>
+        <w:rPr>
+          <w:lang w:val="en-US"/>
+        </w:rPr>
+      </w:pPr>
+      <w:r>
+        <w:rPr>
+          <w:lang w:val="en-US"/>
+        </w:rPr>
+        <w:t>CATEGORIE_</w:t>
+      </w:r>
+      <w:proofErr w:type="gramStart"/>
+      <w:r>
+        <w:rPr>
+          <w:lang w:val="en-US"/>
+        </w:rPr>
+        <w:t>BILLET(</w:t>
+      </w:r>
+      <w:proofErr w:type="spellStart"/>
+      <w:proofErr w:type="gramEnd"/>
       <w:r>
         <w:rPr>
           <w:lang w:val="en-US"/>
@@ -603,10 +551,12 @@
     </w:p>
     <w:p>
       <w:pPr>
-        <w:rPr>
-          <w:lang w:val="en-US"/>
-        </w:rPr>
-      </w:pPr>
+        <w:ind w:left="360"/>
+        <w:rPr>
+          <w:lang w:val="en-US"/>
+        </w:rPr>
+      </w:pPr>
+      <w:proofErr w:type="gramStart"/>
       <w:r>
         <w:rPr>
           <w:lang w:val="en-US"/>
@@ -614,6 +564,7 @@
         <w:t>BILLET(</w:t>
       </w:r>
       <w:proofErr w:type="spellStart"/>
+      <w:proofErr w:type="gramEnd"/>
       <w:r>
         <w:rPr>
           <w:lang w:val="en-US"/>
@@ -658,18 +609,20 @@
     </w:p>
     <w:p>
       <w:pPr>
-        <w:rPr>
-          <w:lang w:val="en-US"/>
-        </w:rPr>
-      </w:pPr>
-      <w:r>
-        <w:rPr>
-          <w:lang w:val="en-US"/>
-        </w:rPr>
-        <w:lastRenderedPageBreak/>
+        <w:ind w:left="360"/>
+        <w:rPr>
+          <w:lang w:val="en-US"/>
+        </w:rPr>
+      </w:pPr>
+      <w:proofErr w:type="gramStart"/>
+      <w:r>
+        <w:rPr>
+          <w:lang w:val="en-US"/>
+        </w:rPr>
         <w:t>AFFECTER(</w:t>
       </w:r>
       <w:proofErr w:type="spellStart"/>
+      <w:proofErr w:type="gramEnd"/>
       <w:r>
         <w:rPr>
           <w:lang w:val="en-US"/>
@@ -699,10 +652,15 @@
       </w:r>
     </w:p>
     <w:p>
+      <w:pPr>
+        <w:ind w:left="360"/>
+      </w:pPr>
+      <w:proofErr w:type="gramStart"/>
       <w:r>
         <w:t>UTILISER(</w:t>
       </w:r>
       <w:proofErr w:type="spellStart"/>
+      <w:proofErr w:type="gramEnd"/>
       <w:r>
         <w:t>id_ev</w:t>
       </w:r>
@@ -729,10 +687,12 @@
     </w:p>
     <w:p>
       <w:pPr>
-        <w:rPr>
-          <w:lang w:val="en-US"/>
-        </w:rPr>
-      </w:pPr>
+        <w:ind w:left="360"/>
+        <w:rPr>
+          <w:lang w:val="en-US"/>
+        </w:rPr>
+      </w:pPr>
+      <w:proofErr w:type="gramStart"/>
       <w:r>
         <w:rPr>
           <w:lang w:val="en-US"/>
@@ -740,782 +700,7 @@
         <w:t>FINANCER(</w:t>
       </w:r>
       <w:proofErr w:type="spellStart"/>
-      <w:r>
-        <w:rPr>
-          <w:lang w:val="en-US"/>
-        </w:rPr>
-        <w:t>id_ev</w:t>
-      </w:r>
-      <w:proofErr w:type="spellEnd"/>
-      <w:r>
-        <w:rPr>
-          <w:lang w:val="en-US"/>
-        </w:rPr>
-        <w:t xml:space="preserve"> PK/FK, </w:t>
-      </w:r>
-      <w:proofErr w:type="spellStart"/>
-      <w:r>
-        <w:rPr>
-          <w:lang w:val="en-US"/>
-        </w:rPr>
-        <w:t>id_spons</w:t>
-      </w:r>
-      <w:proofErr w:type="spellEnd"/>
-      <w:r>
-        <w:rPr>
-          <w:lang w:val="en-US"/>
-        </w:rPr>
-        <w:t xml:space="preserve"> PK/FK, </w:t>
-      </w:r>
-      <w:proofErr w:type="spellStart"/>
-      <w:r>
-        <w:rPr>
-          <w:lang w:val="en-US"/>
-        </w:rPr>
-        <w:t>montant</w:t>
-      </w:r>
-      <w:proofErr w:type="spellEnd"/>
-      <w:r>
-        <w:rPr>
-          <w:lang w:val="en-US"/>
-        </w:rPr>
-        <w:t>)</w:t>
-      </w:r>
-    </w:p>
-    <w:p>
-      <w:r>
-        <w:t>Les clés étrangères doivent faire référence aux clés primaires existantes.</w:t>
-      </w:r>
-    </w:p>
-    <w:p>
-      <w:r>
-        <w:t>Nombre de lignes souhaitées par table :</w:t>
-      </w:r>
-    </w:p>
-    <w:p>
-      <w:r>
-        <w:t>LIEU : 10</w:t>
-      </w:r>
-      <w:r>
-        <w:br/>
-        <w:t>ARTISTE : 25</w:t>
-      </w:r>
-      <w:r>
-        <w:br/>
-        <w:t>EMPLOYE : 12</w:t>
-      </w:r>
-      <w:r>
-        <w:br/>
-        <w:t>SPONSOR : 8</w:t>
-      </w:r>
-      <w:r>
-        <w:br/>
-        <w:t>MATERIEL : 15</w:t>
-      </w:r>
-      <w:r>
-        <w:br/>
-        <w:t>PARTICIPANT : 80</w:t>
-      </w:r>
-      <w:r>
-        <w:br/>
-        <w:t>EVENEMENT : 12</w:t>
-      </w:r>
-      <w:r>
-        <w:br/>
-        <w:t>CONTRAT : 30</w:t>
-      </w:r>
-      <w:r>
-        <w:br/>
-        <w:t>CATEGORIE_BILLET : 30</w:t>
-      </w:r>
-      <w:r>
-        <w:br/>
-        <w:t>BILLET : 250</w:t>
-      </w:r>
-      <w:r>
-        <w:br/>
-        <w:t>AFFECTER : 30</w:t>
-      </w:r>
-      <w:r>
-        <w:br/>
-        <w:t>UTILISER : 25</w:t>
-      </w:r>
-      <w:r>
-        <w:br/>
-        <w:t>FINANCER : 20</w:t>
-      </w:r>
-    </w:p>
-    <w:p>
-      <w:r>
-        <w:t xml:space="preserve">Les clés étrangères doivent faire référence aux clés primaires existantes : donne les lignes en commençant par remplir les tables dans lesquelles il n'y a pas de clés étrangères, puis les tables dans lesquelles les clés étrangères font références à des clés primaires des tables déjà remplies. </w:t>
-      </w:r>
-      <w:r>
-        <w:t xml:space="preserve"> </w:t>
-      </w:r>
-      <w:r>
-        <w:t>Fournis l’ensemble sous la forme d’un script SQL contenant uniquement des requêtes INSERT INTO prêt à être exécuté.</w:t>
-      </w:r>
-    </w:p>
-    <w:p/>
-    <w:p>
-      <w:pPr>
-        <w:pStyle w:val="Paragraphedeliste"/>
-        <w:numPr>
-          <w:ilvl w:val="0"/>
-          <w:numId w:val="1"/>
-        </w:numPr>
-      </w:pPr>
-      <w:r>
-        <w:t xml:space="preserve">Prompt version avec « contraintes » : </w:t>
-      </w:r>
-    </w:p>
-    <w:p>
-      <w:pPr>
-        <w:ind w:left="360"/>
-      </w:pPr>
-      <w:r>
-        <w:t>Donne les requêtes d’insertion permettant de remplir la base de données dont le modèle relationnel est le suivant :</w:t>
-      </w:r>
-    </w:p>
-    <w:p>
-      <w:pPr>
-        <w:ind w:left="360"/>
-      </w:pPr>
-      <w:r>
-        <w:t>LIEU(</w:t>
-      </w:r>
-      <w:proofErr w:type="spellStart"/>
-      <w:r>
-        <w:t>id_lieu</w:t>
-      </w:r>
-      <w:proofErr w:type="spellEnd"/>
-      <w:r>
-        <w:t xml:space="preserve"> PK, </w:t>
-      </w:r>
-      <w:proofErr w:type="spellStart"/>
-      <w:r>
-        <w:t>nom_lieu</w:t>
-      </w:r>
-      <w:proofErr w:type="spellEnd"/>
-      <w:r>
-        <w:t xml:space="preserve">, </w:t>
-      </w:r>
-      <w:proofErr w:type="spellStart"/>
-      <w:r>
-        <w:t>capacite_max_lieu</w:t>
-      </w:r>
-      <w:proofErr w:type="spellEnd"/>
-      <w:r>
-        <w:t xml:space="preserve">, </w:t>
-      </w:r>
-      <w:proofErr w:type="spellStart"/>
-      <w:r>
-        <w:t>ville_lieu</w:t>
-      </w:r>
-      <w:proofErr w:type="spellEnd"/>
-      <w:r>
-        <w:t>)</w:t>
-      </w:r>
-    </w:p>
-    <w:p>
-      <w:pPr>
-        <w:ind w:left="360"/>
-        <w:rPr>
-          <w:lang w:val="en-US"/>
-        </w:rPr>
-      </w:pPr>
-      <w:r>
-        <w:rPr>
-          <w:lang w:val="en-US"/>
-        </w:rPr>
-        <w:t>ARTISTE(</w:t>
-      </w:r>
-      <w:proofErr w:type="spellStart"/>
-      <w:r>
-        <w:rPr>
-          <w:lang w:val="en-US"/>
-        </w:rPr>
-        <w:t>id_art</w:t>
-      </w:r>
-      <w:proofErr w:type="spellEnd"/>
-      <w:r>
-        <w:rPr>
-          <w:lang w:val="en-US"/>
-        </w:rPr>
-        <w:t xml:space="preserve"> PK, </w:t>
-      </w:r>
-      <w:proofErr w:type="spellStart"/>
-      <w:r>
-        <w:rPr>
-          <w:lang w:val="en-US"/>
-        </w:rPr>
-        <w:t>nom_art</w:t>
-      </w:r>
-      <w:proofErr w:type="spellEnd"/>
-      <w:r>
-        <w:rPr>
-          <w:lang w:val="en-US"/>
-        </w:rPr>
-        <w:t xml:space="preserve">, </w:t>
-      </w:r>
-      <w:proofErr w:type="spellStart"/>
-      <w:r>
-        <w:rPr>
-          <w:lang w:val="en-US"/>
-        </w:rPr>
-        <w:t>type_art</w:t>
-      </w:r>
-      <w:proofErr w:type="spellEnd"/>
-      <w:r>
-        <w:rPr>
-          <w:lang w:val="en-US"/>
-        </w:rPr>
-        <w:t xml:space="preserve">, </w:t>
-      </w:r>
-      <w:proofErr w:type="spellStart"/>
-      <w:r>
-        <w:rPr>
-          <w:lang w:val="en-US"/>
-        </w:rPr>
-        <w:t>nationalite_art</w:t>
-      </w:r>
-      <w:proofErr w:type="spellEnd"/>
-      <w:r>
-        <w:rPr>
-          <w:lang w:val="en-US"/>
-        </w:rPr>
-        <w:t>)</w:t>
-      </w:r>
-    </w:p>
-    <w:p>
-      <w:pPr>
-        <w:ind w:left="360"/>
-        <w:rPr>
-          <w:lang w:val="en-US"/>
-        </w:rPr>
-      </w:pPr>
-      <w:r>
-        <w:rPr>
-          <w:lang w:val="en-US"/>
-        </w:rPr>
-        <w:t>EMPLOYE(</w:t>
-      </w:r>
-      <w:proofErr w:type="spellStart"/>
-      <w:r>
-        <w:rPr>
-          <w:lang w:val="en-US"/>
-        </w:rPr>
-        <w:t>id_emp</w:t>
-      </w:r>
-      <w:proofErr w:type="spellEnd"/>
-      <w:r>
-        <w:rPr>
-          <w:lang w:val="en-US"/>
-        </w:rPr>
-        <w:t xml:space="preserve"> PK, </w:t>
-      </w:r>
-      <w:proofErr w:type="spellStart"/>
-      <w:r>
-        <w:rPr>
-          <w:lang w:val="en-US"/>
-        </w:rPr>
-        <w:t>nom_emp</w:t>
-      </w:r>
-      <w:proofErr w:type="spellEnd"/>
-      <w:r>
-        <w:rPr>
-          <w:lang w:val="en-US"/>
-        </w:rPr>
-        <w:t xml:space="preserve">, </w:t>
-      </w:r>
-      <w:proofErr w:type="spellStart"/>
-      <w:r>
-        <w:rPr>
-          <w:lang w:val="en-US"/>
-        </w:rPr>
-        <w:t>fonction_emp</w:t>
-      </w:r>
-      <w:proofErr w:type="spellEnd"/>
-      <w:r>
-        <w:rPr>
-          <w:lang w:val="en-US"/>
-        </w:rPr>
-        <w:t xml:space="preserve">, </w:t>
-      </w:r>
-      <w:proofErr w:type="spellStart"/>
-      <w:r>
-        <w:rPr>
-          <w:lang w:val="en-US"/>
-        </w:rPr>
-        <w:t>id_emp_superieur</w:t>
-      </w:r>
-      <w:proofErr w:type="spellEnd"/>
-      <w:r>
-        <w:rPr>
-          <w:lang w:val="en-US"/>
-        </w:rPr>
-        <w:t xml:space="preserve"> FK)</w:t>
-      </w:r>
-    </w:p>
-    <w:p>
-      <w:pPr>
-        <w:ind w:left="360"/>
-        <w:rPr>
-          <w:lang w:val="en-US"/>
-        </w:rPr>
-      </w:pPr>
-      <w:r>
-        <w:rPr>
-          <w:lang w:val="en-US"/>
-        </w:rPr>
-        <w:t>SPONSOR(</w:t>
-      </w:r>
-      <w:proofErr w:type="spellStart"/>
-      <w:r>
-        <w:rPr>
-          <w:lang w:val="en-US"/>
-        </w:rPr>
-        <w:t>id_spons</w:t>
-      </w:r>
-      <w:proofErr w:type="spellEnd"/>
-      <w:r>
-        <w:rPr>
-          <w:lang w:val="en-US"/>
-        </w:rPr>
-        <w:t xml:space="preserve"> PK, </w:t>
-      </w:r>
-      <w:proofErr w:type="spellStart"/>
-      <w:r>
-        <w:rPr>
-          <w:lang w:val="en-US"/>
-        </w:rPr>
-        <w:t>nom_spons</w:t>
-      </w:r>
-      <w:proofErr w:type="spellEnd"/>
-      <w:r>
-        <w:rPr>
-          <w:lang w:val="en-US"/>
-        </w:rPr>
-        <w:t>)</w:t>
-      </w:r>
-    </w:p>
-    <w:p>
-      <w:pPr>
-        <w:ind w:left="360"/>
-        <w:rPr>
-          <w:lang w:val="en-US"/>
-        </w:rPr>
-      </w:pPr>
-      <w:r>
-        <w:rPr>
-          <w:lang w:val="en-US"/>
-        </w:rPr>
-        <w:t>MATERIEL(</w:t>
-      </w:r>
-      <w:proofErr w:type="spellStart"/>
-      <w:r>
-        <w:rPr>
-          <w:lang w:val="en-US"/>
-        </w:rPr>
-        <w:t>id_mat</w:t>
-      </w:r>
-      <w:proofErr w:type="spellEnd"/>
-      <w:r>
-        <w:rPr>
-          <w:lang w:val="en-US"/>
-        </w:rPr>
-        <w:t xml:space="preserve"> PK, </w:t>
-      </w:r>
-      <w:proofErr w:type="spellStart"/>
-      <w:r>
-        <w:rPr>
-          <w:lang w:val="en-US"/>
-        </w:rPr>
-        <w:t>type_mat</w:t>
-      </w:r>
-      <w:proofErr w:type="spellEnd"/>
-      <w:r>
-        <w:rPr>
-          <w:lang w:val="en-US"/>
-        </w:rPr>
-        <w:t>)</w:t>
-      </w:r>
-    </w:p>
-    <w:p>
-      <w:pPr>
-        <w:ind w:left="360"/>
-      </w:pPr>
-      <w:r>
-        <w:t>PARTICIPANT(</w:t>
-      </w:r>
-      <w:proofErr w:type="spellStart"/>
-      <w:r>
-        <w:t>id_part</w:t>
-      </w:r>
-      <w:proofErr w:type="spellEnd"/>
-      <w:r>
-        <w:t xml:space="preserve"> PK, </w:t>
-      </w:r>
-      <w:proofErr w:type="spellStart"/>
-      <w:r>
-        <w:t>nom_part</w:t>
-      </w:r>
-      <w:proofErr w:type="spellEnd"/>
-      <w:r>
-        <w:t xml:space="preserve">, </w:t>
-      </w:r>
-      <w:proofErr w:type="spellStart"/>
-      <w:r>
-        <w:t>email_part</w:t>
-      </w:r>
-      <w:proofErr w:type="spellEnd"/>
-      <w:r>
-        <w:t xml:space="preserve">, </w:t>
-      </w:r>
-      <w:proofErr w:type="spellStart"/>
-      <w:r>
-        <w:t>num_part</w:t>
-      </w:r>
-      <w:proofErr w:type="spellEnd"/>
-      <w:r>
-        <w:t>)</w:t>
-      </w:r>
-    </w:p>
-    <w:p>
-      <w:pPr>
-        <w:ind w:left="360"/>
-      </w:pPr>
-      <w:r>
-        <w:lastRenderedPageBreak/>
-        <w:t>EVENEMENT(</w:t>
-      </w:r>
-      <w:proofErr w:type="spellStart"/>
-      <w:r>
-        <w:t>id_ev</w:t>
-      </w:r>
-      <w:proofErr w:type="spellEnd"/>
-      <w:r>
-        <w:t xml:space="preserve"> PK, </w:t>
-      </w:r>
-      <w:proofErr w:type="spellStart"/>
-      <w:r>
-        <w:t>nom_ev</w:t>
-      </w:r>
-      <w:proofErr w:type="spellEnd"/>
-      <w:r>
-        <w:t xml:space="preserve">, </w:t>
-      </w:r>
-      <w:proofErr w:type="spellStart"/>
-      <w:r>
-        <w:t>type_ev</w:t>
-      </w:r>
-      <w:proofErr w:type="spellEnd"/>
-      <w:r>
-        <w:t xml:space="preserve">, </w:t>
-      </w:r>
-      <w:proofErr w:type="spellStart"/>
-      <w:r>
-        <w:t>date_debut_ev</w:t>
-      </w:r>
-      <w:proofErr w:type="spellEnd"/>
-      <w:r>
-        <w:t xml:space="preserve">, </w:t>
-      </w:r>
-      <w:proofErr w:type="spellStart"/>
-      <w:r>
-        <w:t>date_fin_ev</w:t>
-      </w:r>
-      <w:proofErr w:type="spellEnd"/>
-      <w:r>
-        <w:t xml:space="preserve">, </w:t>
-      </w:r>
-      <w:proofErr w:type="spellStart"/>
-      <w:r>
-        <w:t>statut_ev</w:t>
-      </w:r>
-      <w:proofErr w:type="spellEnd"/>
-      <w:r>
-        <w:t xml:space="preserve">, </w:t>
-      </w:r>
-      <w:proofErr w:type="spellStart"/>
-      <w:r>
-        <w:t>id_lieu</w:t>
-      </w:r>
-      <w:proofErr w:type="spellEnd"/>
-      <w:r>
-        <w:t xml:space="preserve"> FK)</w:t>
-      </w:r>
-    </w:p>
-    <w:p>
-      <w:pPr>
-        <w:ind w:left="360"/>
-      </w:pPr>
-      <w:r>
-        <w:t>CONTRAT(</w:t>
-      </w:r>
-      <w:proofErr w:type="spellStart"/>
-      <w:r>
-        <w:t>id_ev</w:t>
-      </w:r>
-      <w:proofErr w:type="spellEnd"/>
-      <w:r>
-        <w:t xml:space="preserve"> PK/FK, </w:t>
-      </w:r>
-      <w:proofErr w:type="spellStart"/>
-      <w:r>
-        <w:t>id_art</w:t>
-      </w:r>
-      <w:proofErr w:type="spellEnd"/>
-      <w:r>
-        <w:t xml:space="preserve"> PK/FK, </w:t>
-      </w:r>
-      <w:proofErr w:type="spellStart"/>
-      <w:r>
-        <w:t>id_contr</w:t>
-      </w:r>
-      <w:proofErr w:type="spellEnd"/>
-      <w:r>
-        <w:t xml:space="preserve"> PK, </w:t>
-      </w:r>
-      <w:proofErr w:type="spellStart"/>
-      <w:r>
-        <w:t>montant_contr</w:t>
-      </w:r>
-      <w:proofErr w:type="spellEnd"/>
-      <w:r>
-        <w:t xml:space="preserve">, </w:t>
-      </w:r>
-      <w:proofErr w:type="spellStart"/>
-      <w:r>
-        <w:t>date_signature_contr</w:t>
-      </w:r>
-      <w:proofErr w:type="spellEnd"/>
-      <w:r>
-        <w:t xml:space="preserve">, </w:t>
-      </w:r>
-      <w:proofErr w:type="spellStart"/>
-      <w:r>
-        <w:t>statut_contr</w:t>
-      </w:r>
-      <w:proofErr w:type="spellEnd"/>
-      <w:r>
-        <w:t>)</w:t>
-      </w:r>
-    </w:p>
-    <w:p>
-      <w:pPr>
-        <w:ind w:left="360"/>
-        <w:rPr>
-          <w:lang w:val="en-US"/>
-        </w:rPr>
-      </w:pPr>
-      <w:r>
-        <w:rPr>
-          <w:lang w:val="en-US"/>
-        </w:rPr>
-        <w:t>CATEGORIE_BILLET(</w:t>
-      </w:r>
-      <w:proofErr w:type="spellStart"/>
-      <w:r>
-        <w:rPr>
-          <w:lang w:val="en-US"/>
-        </w:rPr>
-        <w:t>id_cat</w:t>
-      </w:r>
-      <w:proofErr w:type="spellEnd"/>
-      <w:r>
-        <w:rPr>
-          <w:lang w:val="en-US"/>
-        </w:rPr>
-        <w:t xml:space="preserve"> PK, </w:t>
-      </w:r>
-      <w:proofErr w:type="spellStart"/>
-      <w:r>
-        <w:rPr>
-          <w:lang w:val="en-US"/>
-        </w:rPr>
-        <w:t>prix_cat</w:t>
-      </w:r>
-      <w:proofErr w:type="spellEnd"/>
-      <w:r>
-        <w:rPr>
-          <w:lang w:val="en-US"/>
-        </w:rPr>
-        <w:t xml:space="preserve">, </w:t>
-      </w:r>
-      <w:proofErr w:type="spellStart"/>
-      <w:r>
-        <w:rPr>
-          <w:lang w:val="en-US"/>
-        </w:rPr>
-        <w:t>nbr_place_dispo</w:t>
-      </w:r>
-      <w:proofErr w:type="spellEnd"/>
-      <w:r>
-        <w:rPr>
-          <w:lang w:val="en-US"/>
-        </w:rPr>
-        <w:t xml:space="preserve">, </w:t>
-      </w:r>
-      <w:proofErr w:type="spellStart"/>
-      <w:r>
-        <w:rPr>
-          <w:lang w:val="en-US"/>
-        </w:rPr>
-        <w:t>id_ev</w:t>
-      </w:r>
-      <w:proofErr w:type="spellEnd"/>
-      <w:r>
-        <w:rPr>
-          <w:lang w:val="en-US"/>
-        </w:rPr>
-        <w:t xml:space="preserve"> FK)</w:t>
-      </w:r>
-    </w:p>
-    <w:p>
-      <w:pPr>
-        <w:ind w:left="360"/>
-        <w:rPr>
-          <w:lang w:val="en-US"/>
-        </w:rPr>
-      </w:pPr>
-      <w:r>
-        <w:rPr>
-          <w:lang w:val="en-US"/>
-        </w:rPr>
-        <w:t>BILLET(</w:t>
-      </w:r>
-      <w:proofErr w:type="spellStart"/>
-      <w:r>
-        <w:rPr>
-          <w:lang w:val="en-US"/>
-        </w:rPr>
-        <w:t>id_billet</w:t>
-      </w:r>
-      <w:proofErr w:type="spellEnd"/>
-      <w:r>
-        <w:rPr>
-          <w:lang w:val="en-US"/>
-        </w:rPr>
-        <w:t xml:space="preserve"> PK, </w:t>
-      </w:r>
-      <w:proofErr w:type="spellStart"/>
-      <w:r>
-        <w:rPr>
-          <w:lang w:val="en-US"/>
-        </w:rPr>
-        <w:t>id_cat</w:t>
-      </w:r>
-      <w:proofErr w:type="spellEnd"/>
-      <w:r>
-        <w:rPr>
-          <w:lang w:val="en-US"/>
-        </w:rPr>
-        <w:t xml:space="preserve"> FK, </w:t>
-      </w:r>
-      <w:proofErr w:type="spellStart"/>
-      <w:r>
-        <w:rPr>
-          <w:lang w:val="en-US"/>
-        </w:rPr>
-        <w:t>id_part</w:t>
-      </w:r>
-      <w:proofErr w:type="spellEnd"/>
-      <w:r>
-        <w:rPr>
-          <w:lang w:val="en-US"/>
-        </w:rPr>
-        <w:t xml:space="preserve"> FK)</w:t>
-      </w:r>
-    </w:p>
-    <w:p>
-      <w:pPr>
-        <w:ind w:left="360"/>
-        <w:rPr>
-          <w:lang w:val="en-US"/>
-        </w:rPr>
-      </w:pPr>
-      <w:r>
-        <w:rPr>
-          <w:lang w:val="en-US"/>
-        </w:rPr>
-        <w:t>AFFECTER(</w:t>
-      </w:r>
-      <w:proofErr w:type="spellStart"/>
-      <w:r>
-        <w:rPr>
-          <w:lang w:val="en-US"/>
-        </w:rPr>
-        <w:t>id_ev</w:t>
-      </w:r>
-      <w:proofErr w:type="spellEnd"/>
-      <w:r>
-        <w:rPr>
-          <w:lang w:val="en-US"/>
-        </w:rPr>
-        <w:t xml:space="preserve"> PK/FK, </w:t>
-      </w:r>
-      <w:proofErr w:type="spellStart"/>
-      <w:r>
-        <w:rPr>
-          <w:lang w:val="en-US"/>
-        </w:rPr>
-        <w:t>id_emp</w:t>
-      </w:r>
-      <w:proofErr w:type="spellEnd"/>
-      <w:r>
-        <w:rPr>
-          <w:lang w:val="en-US"/>
-        </w:rPr>
-        <w:t xml:space="preserve"> PK/FK)</w:t>
-      </w:r>
-    </w:p>
-    <w:p>
-      <w:pPr>
-        <w:ind w:left="360"/>
-      </w:pPr>
-      <w:r>
-        <w:t>UTILISER(</w:t>
-      </w:r>
-      <w:proofErr w:type="spellStart"/>
-      <w:r>
-        <w:t>id_ev</w:t>
-      </w:r>
-      <w:proofErr w:type="spellEnd"/>
-      <w:r>
-        <w:t xml:space="preserve"> PK/FK, </w:t>
-      </w:r>
-      <w:proofErr w:type="spellStart"/>
-      <w:r>
-        <w:t>id_mat</w:t>
-      </w:r>
-      <w:proofErr w:type="spellEnd"/>
-      <w:r>
-        <w:t xml:space="preserve"> PK/FK, </w:t>
-      </w:r>
-      <w:proofErr w:type="spellStart"/>
-      <w:r>
-        <w:t>quantite</w:t>
-      </w:r>
-      <w:proofErr w:type="spellEnd"/>
-      <w:r>
-        <w:t>)</w:t>
-      </w:r>
-    </w:p>
-    <w:p>
-      <w:pPr>
-        <w:ind w:left="360"/>
-        <w:rPr>
-          <w:lang w:val="en-US"/>
-        </w:rPr>
-      </w:pPr>
-      <w:r>
-        <w:rPr>
-          <w:lang w:val="en-US"/>
-        </w:rPr>
-        <w:t>FINANCER(</w:t>
-      </w:r>
-      <w:proofErr w:type="spellStart"/>
+      <w:proofErr w:type="gramEnd"/>
       <w:r>
         <w:rPr>
           <w:lang w:val="en-US"/>
@@ -1597,7 +782,13 @@
         </w:numPr>
       </w:pPr>
       <w:r>
-        <w:t>ARTISTE : 25 lignes</w:t>
+        <w:t xml:space="preserve">ARTISTE : </w:t>
+      </w:r>
+      <w:r>
+        <w:t>15</w:t>
+      </w:r>
+      <w:r>
+        <w:t xml:space="preserve"> lignes</w:t>
       </w:r>
     </w:p>
     <w:p>
@@ -1608,7 +799,13 @@
         </w:numPr>
       </w:pPr>
       <w:r>
-        <w:t>EMPLOYE : 12 lignes</w:t>
+        <w:t>EMPLOYE : 1</w:t>
+      </w:r>
+      <w:r>
+        <w:t>0</w:t>
+      </w:r>
+      <w:r>
+        <w:t xml:space="preserve"> lignes</w:t>
       </w:r>
     </w:p>
     <w:p>
@@ -1619,7 +816,13 @@
         </w:numPr>
       </w:pPr>
       <w:r>
-        <w:t>SPONSOR : 8 lignes</w:t>
+        <w:t xml:space="preserve">SPONSOR : </w:t>
+      </w:r>
+      <w:r>
+        <w:t>5</w:t>
+      </w:r>
+      <w:r>
+        <w:t xml:space="preserve"> lignes</w:t>
       </w:r>
     </w:p>
     <w:p>
@@ -1630,7 +833,13 @@
         </w:numPr>
       </w:pPr>
       <w:r>
-        <w:t>MATERIEL : 15 lignes</w:t>
+        <w:t>MATERIEL : 1</w:t>
+      </w:r>
+      <w:r>
+        <w:t>0</w:t>
+      </w:r>
+      <w:r>
+        <w:t xml:space="preserve"> lignes</w:t>
       </w:r>
     </w:p>
     <w:p>
@@ -1641,7 +850,13 @@
         </w:numPr>
       </w:pPr>
       <w:r>
-        <w:t>PARTICIPANT : 80 lignes</w:t>
+        <w:t xml:space="preserve">PARTICIPANT : </w:t>
+      </w:r>
+      <w:r>
+        <w:t>40</w:t>
+      </w:r>
+      <w:r>
+        <w:t xml:space="preserve"> lignes</w:t>
       </w:r>
     </w:p>
     <w:p>
@@ -1652,7 +867,13 @@
         </w:numPr>
       </w:pPr>
       <w:r>
-        <w:t>EVENEMENT : 12 lignes</w:t>
+        <w:t>EVENEMENT : 1</w:t>
+      </w:r>
+      <w:r>
+        <w:t>0</w:t>
+      </w:r>
+      <w:r>
+        <w:t xml:space="preserve"> lignes</w:t>
       </w:r>
     </w:p>
     <w:p>
@@ -1663,7 +884,14 @@
         </w:numPr>
       </w:pPr>
       <w:r>
-        <w:t>CONTRAT : 30 lignes</w:t>
+        <w:lastRenderedPageBreak/>
+        <w:t xml:space="preserve">CONTRAT :  </w:t>
+      </w:r>
+      <w:r>
+        <w:t xml:space="preserve">30 </w:t>
+      </w:r>
+      <w:r>
+        <w:t>lignes</w:t>
       </w:r>
     </w:p>
     <w:p>
@@ -1674,7 +902,13 @@
         </w:numPr>
       </w:pPr>
       <w:r>
-        <w:t>CATEGORIE_BILLET : 30 lignes</w:t>
+        <w:t xml:space="preserve">CATEGORIE_BILLET : </w:t>
+      </w:r>
+      <w:r>
+        <w:t>5</w:t>
+      </w:r>
+      <w:r>
+        <w:t xml:space="preserve"> lignes</w:t>
       </w:r>
     </w:p>
     <w:p>
@@ -1685,7 +919,13 @@
         </w:numPr>
       </w:pPr>
       <w:r>
-        <w:t>BILLET : 250 lignes</w:t>
+        <w:t xml:space="preserve">BILLET : </w:t>
+      </w:r>
+      <w:r>
+        <w:t>50</w:t>
+      </w:r>
+      <w:r>
+        <w:t xml:space="preserve"> lignes</w:t>
       </w:r>
     </w:p>
     <w:p>
@@ -1696,7 +936,13 @@
         </w:numPr>
       </w:pPr>
       <w:r>
-        <w:t>AFFECTER : 30 lignes</w:t>
+        <w:t xml:space="preserve">AFFECTER : </w:t>
+      </w:r>
+      <w:r>
+        <w:t>20</w:t>
+      </w:r>
+      <w:r>
+        <w:t xml:space="preserve"> lignes</w:t>
       </w:r>
     </w:p>
     <w:p>
@@ -1707,7 +953,13 @@
         </w:numPr>
       </w:pPr>
       <w:r>
-        <w:t>UTILISER : 25 lignes</w:t>
+        <w:t>UTILISER : 2</w:t>
+      </w:r>
+      <w:r>
+        <w:t>0</w:t>
+      </w:r>
+      <w:r>
+        <w:t xml:space="preserve"> lignes</w:t>
       </w:r>
     </w:p>
     <w:p>
@@ -1718,7 +970,13 @@
         </w:numPr>
       </w:pPr>
       <w:r>
-        <w:t>FINANCER : 20 lignes</w:t>
+        <w:t xml:space="preserve">FINANCER : </w:t>
+      </w:r>
+      <w:r>
+        <w:t>5</w:t>
+      </w:r>
+      <w:r>
+        <w:t xml:space="preserve"> lignes</w:t>
       </w:r>
     </w:p>
     <w:p>
@@ -1759,183 +1017,191 @@
         </w:numPr>
       </w:pPr>
       <w:r>
+        <w:t>La date de fin d’un événement doit être postérieure à la date de début.</w:t>
+      </w:r>
+    </w:p>
+    <w:p>
+      <w:pPr>
+        <w:numPr>
+          <w:ilvl w:val="0"/>
+          <w:numId w:val="4"/>
+        </w:numPr>
+      </w:pPr>
+      <w:r>
+        <w:t>Les prix des billets doivent être positifs.</w:t>
+      </w:r>
+    </w:p>
+    <w:p>
+      <w:pPr>
+        <w:numPr>
+          <w:ilvl w:val="0"/>
+          <w:numId w:val="4"/>
+        </w:numPr>
+      </w:pPr>
+      <w:r>
+        <w:t>Les montants des contrats et des financements doivent être positifs.</w:t>
+      </w:r>
+    </w:p>
+    <w:p>
+      <w:pPr>
+        <w:numPr>
+          <w:ilvl w:val="0"/>
+          <w:numId w:val="4"/>
+        </w:numPr>
+      </w:pPr>
+      <w:r>
+        <w:t xml:space="preserve">Les adresses </w:t>
+      </w:r>
+      <w:proofErr w:type="gramStart"/>
+      <w:r>
+        <w:t>email</w:t>
+      </w:r>
+      <w:proofErr w:type="gramEnd"/>
+      <w:r>
+        <w:t xml:space="preserve"> des participants doivent avoir un format valide.</w:t>
+      </w:r>
+    </w:p>
+    <w:p>
+      <w:pPr>
+        <w:numPr>
+          <w:ilvl w:val="0"/>
+          <w:numId w:val="4"/>
+        </w:numPr>
+      </w:pPr>
+      <w:r>
+        <w:t>Les valeurs doivent être réalistes pour un système de gestion d’événements musicaux.</w:t>
+      </w:r>
+    </w:p>
+    <w:p>
+      <w:pPr>
+        <w:ind w:left="360"/>
+      </w:pPr>
+      <w:r>
+        <w:t xml:space="preserve">Les clés étrangères doivent faire référence aux clés primaires existantes : donne les lignes en commençant par remplir les tables dans lesquelles il n'y a pas de clés étrangères, puis les tables dans lesquelles les clés étrangères font références à des clés primaires des tables déjà remplies. </w:t>
+      </w:r>
+      <w:r>
+        <w:t>LIEU</w:t>
+      </w:r>
+    </w:p>
+    <w:p>
+      <w:pPr>
+        <w:numPr>
+          <w:ilvl w:val="0"/>
+          <w:numId w:val="5"/>
+        </w:numPr>
+      </w:pPr>
+      <w:r>
+        <w:t>ARTISTE</w:t>
+      </w:r>
+    </w:p>
+    <w:p>
+      <w:pPr>
+        <w:numPr>
+          <w:ilvl w:val="0"/>
+          <w:numId w:val="5"/>
+        </w:numPr>
+      </w:pPr>
+      <w:r>
+        <w:t>EMPLOYE</w:t>
+      </w:r>
+    </w:p>
+    <w:p>
+      <w:pPr>
+        <w:numPr>
+          <w:ilvl w:val="0"/>
+          <w:numId w:val="5"/>
+        </w:numPr>
+      </w:pPr>
+      <w:r>
+        <w:t>SPONSOR</w:t>
+      </w:r>
+    </w:p>
+    <w:p>
+      <w:pPr>
+        <w:numPr>
+          <w:ilvl w:val="0"/>
+          <w:numId w:val="5"/>
+        </w:numPr>
+      </w:pPr>
+      <w:r>
+        <w:t>MATERIEL</w:t>
+      </w:r>
+    </w:p>
+    <w:p>
+      <w:pPr>
+        <w:numPr>
+          <w:ilvl w:val="0"/>
+          <w:numId w:val="5"/>
+        </w:numPr>
+      </w:pPr>
+      <w:r>
+        <w:t>PARTICIPANT</w:t>
+      </w:r>
+    </w:p>
+    <w:p>
+      <w:pPr>
+        <w:numPr>
+          <w:ilvl w:val="0"/>
+          <w:numId w:val="5"/>
+        </w:numPr>
+      </w:pPr>
+      <w:r>
+        <w:t>EVENEMENT</w:t>
+      </w:r>
+    </w:p>
+    <w:p>
+      <w:pPr>
+        <w:numPr>
+          <w:ilvl w:val="0"/>
+          <w:numId w:val="5"/>
+        </w:numPr>
+      </w:pPr>
+      <w:r>
+        <w:t>CONTRAT</w:t>
+      </w:r>
+    </w:p>
+    <w:p>
+      <w:pPr>
+        <w:numPr>
+          <w:ilvl w:val="0"/>
+          <w:numId w:val="5"/>
+        </w:numPr>
+      </w:pPr>
+      <w:r>
+        <w:t>CATEGORIE_BILLET</w:t>
+      </w:r>
+    </w:p>
+    <w:p>
+      <w:pPr>
+        <w:numPr>
+          <w:ilvl w:val="0"/>
+          <w:numId w:val="5"/>
+        </w:numPr>
+      </w:pPr>
+      <w:r>
+        <w:t>BILLET</w:t>
+      </w:r>
+    </w:p>
+    <w:p>
+      <w:pPr>
+        <w:numPr>
+          <w:ilvl w:val="0"/>
+          <w:numId w:val="5"/>
+        </w:numPr>
+      </w:pPr>
+      <w:r>
+        <w:t>AFFECTER</w:t>
+      </w:r>
+    </w:p>
+    <w:p>
+      <w:pPr>
+        <w:numPr>
+          <w:ilvl w:val="0"/>
+          <w:numId w:val="5"/>
+        </w:numPr>
+      </w:pPr>
+      <w:r>
         <w:lastRenderedPageBreak/>
-        <w:t>La date de fin d’un événement doit être postérieure à la date de début.</w:t>
-      </w:r>
-    </w:p>
-    <w:p>
-      <w:pPr>
-        <w:numPr>
-          <w:ilvl w:val="0"/>
-          <w:numId w:val="4"/>
-        </w:numPr>
-      </w:pPr>
-      <w:r>
-        <w:t>Les prix des billets doivent être positifs.</w:t>
-      </w:r>
-    </w:p>
-    <w:p>
-      <w:pPr>
-        <w:numPr>
-          <w:ilvl w:val="0"/>
-          <w:numId w:val="4"/>
-        </w:numPr>
-      </w:pPr>
-      <w:r>
-        <w:t>Les montants des contrats et des financements doivent être positifs.</w:t>
-      </w:r>
-    </w:p>
-    <w:p>
-      <w:pPr>
-        <w:numPr>
-          <w:ilvl w:val="0"/>
-          <w:numId w:val="4"/>
-        </w:numPr>
-      </w:pPr>
-      <w:r>
-        <w:t>Les adresses email des participants doivent avoir un format valide.</w:t>
-      </w:r>
-    </w:p>
-    <w:p>
-      <w:pPr>
-        <w:numPr>
-          <w:ilvl w:val="0"/>
-          <w:numId w:val="4"/>
-        </w:numPr>
-      </w:pPr>
-      <w:r>
-        <w:t>Les valeurs doivent être réalistes pour un système de gestion d’événements musicaux.</w:t>
-      </w:r>
-    </w:p>
-    <w:p>
-      <w:pPr>
-        <w:ind w:left="360"/>
-      </w:pPr>
-      <w:r>
-        <w:t xml:space="preserve">Les clés étrangères doivent faire référence aux clés primaires existantes : donne les lignes en commençant par remplir les tables dans lesquelles il n'y a pas de clés étrangères, puis les tables dans lesquelles les clés étrangères font références à des clés primaires des tables déjà remplies. </w:t>
-      </w:r>
-      <w:r>
-        <w:t>LIEU</w:t>
-      </w:r>
-    </w:p>
-    <w:p>
-      <w:pPr>
-        <w:numPr>
-          <w:ilvl w:val="0"/>
-          <w:numId w:val="5"/>
-        </w:numPr>
-      </w:pPr>
-      <w:r>
-        <w:t>ARTISTE</w:t>
-      </w:r>
-    </w:p>
-    <w:p>
-      <w:pPr>
-        <w:numPr>
-          <w:ilvl w:val="0"/>
-          <w:numId w:val="5"/>
-        </w:numPr>
-      </w:pPr>
-      <w:r>
-        <w:t>EMPLOYE</w:t>
-      </w:r>
-    </w:p>
-    <w:p>
-      <w:pPr>
-        <w:numPr>
-          <w:ilvl w:val="0"/>
-          <w:numId w:val="5"/>
-        </w:numPr>
-      </w:pPr>
-      <w:r>
-        <w:t>SPONSOR</w:t>
-      </w:r>
-    </w:p>
-    <w:p>
-      <w:pPr>
-        <w:numPr>
-          <w:ilvl w:val="0"/>
-          <w:numId w:val="5"/>
-        </w:numPr>
-      </w:pPr>
-      <w:r>
-        <w:t>MATERIEL</w:t>
-      </w:r>
-    </w:p>
-    <w:p>
-      <w:pPr>
-        <w:numPr>
-          <w:ilvl w:val="0"/>
-          <w:numId w:val="5"/>
-        </w:numPr>
-      </w:pPr>
-      <w:r>
-        <w:t>PARTICIPANT</w:t>
-      </w:r>
-    </w:p>
-    <w:p>
-      <w:pPr>
-        <w:numPr>
-          <w:ilvl w:val="0"/>
-          <w:numId w:val="5"/>
-        </w:numPr>
-      </w:pPr>
-      <w:r>
-        <w:t>EVENEMENT</w:t>
-      </w:r>
-    </w:p>
-    <w:p>
-      <w:pPr>
-        <w:numPr>
-          <w:ilvl w:val="0"/>
-          <w:numId w:val="5"/>
-        </w:numPr>
-      </w:pPr>
-      <w:r>
-        <w:t>CONTRAT</w:t>
-      </w:r>
-    </w:p>
-    <w:p>
-      <w:pPr>
-        <w:numPr>
-          <w:ilvl w:val="0"/>
-          <w:numId w:val="5"/>
-        </w:numPr>
-      </w:pPr>
-      <w:r>
-        <w:t>CATEGORIE_BILLET</w:t>
-      </w:r>
-    </w:p>
-    <w:p>
-      <w:pPr>
-        <w:numPr>
-          <w:ilvl w:val="0"/>
-          <w:numId w:val="5"/>
-        </w:numPr>
-      </w:pPr>
-      <w:r>
-        <w:t>BILLET</w:t>
-      </w:r>
-    </w:p>
-    <w:p>
-      <w:pPr>
-        <w:numPr>
-          <w:ilvl w:val="0"/>
-          <w:numId w:val="5"/>
-        </w:numPr>
-      </w:pPr>
-      <w:r>
-        <w:t>AFFECTER</w:t>
-      </w:r>
-    </w:p>
-    <w:p>
-      <w:pPr>
-        <w:numPr>
-          <w:ilvl w:val="0"/>
-          <w:numId w:val="5"/>
-        </w:numPr>
-      </w:pPr>
-      <w:r>
         <w:t>UTILISER</w:t>
       </w:r>
     </w:p>

</xml_diff>